<commit_message>
Optimize manual vacancy preparation
</commit_message>
<xml_diff>
--- a/registry/jobs/2026-08-10_211632_nearform_senior-software-engineer-golang/application/CV_ValentinNikolaev_nearform_SeniorSoftwareEngineerGolang.docx
+++ b/registry/jobs/2026-08-10_211632_nearform_senior-software-engineer-golang/application/CV_ValentinNikolaev_nearform_SeniorSoftwareEngineerGolang.docx
@@ -55,7 +55,7 @@
         </w:rPr>
         <w:t xml:space="preserve">Rome, Italy | +39 351 370 1194 | </w:t>
       </w:r>
-      <w:hyperlink w:history="1" r:id="rIddlghw3iec6xsuarlgtqsl">
+      <w:hyperlink w:history="1" r:id="rId-fdtqzuz-ztrg8ls_lapa">
         <w:r>
           <w:rPr>
             <w:rFonts w:ascii="Aptos" w:cs="Aptos" w:eastAsia="Aptos" w:hAnsi="Aptos"/>
@@ -79,7 +79,7 @@
         <w:t xml:space="preserve">
 </w:t>
       </w:r>
-      <w:hyperlink w:history="1" r:id="rIdnpj8r1ywhdgua44lcqc4j">
+      <w:hyperlink w:history="1" r:id="rIdue8jbb3y1oehu15meh60m">
         <w:r>
           <w:rPr>
             <w:rFonts w:ascii="Aptos" w:cs="Aptos" w:eastAsia="Aptos" w:hAnsi="Aptos"/>
@@ -102,7 +102,7 @@
         </w:rPr>
         <w:t xml:space="preserve"> | </w:t>
       </w:r>
-      <w:hyperlink w:history="1" r:id="rIdudeirkmkc05enwn2esp36">
+      <w:hyperlink w:history="1" r:id="rIdlr1ke8lxfeasqccbgyvvx">
         <w:r>
           <w:rPr>
             <w:rFonts w:ascii="Aptos" w:cs="Aptos" w:eastAsia="Aptos" w:hAnsi="Aptos"/>
@@ -421,7 +421,7 @@
           <w:szCs w:val="24"/>
           <w:rtl w:val="false"/>
         </w:rPr>
-        <w:t xml:space="preserve">Software Developer</w:t>
+        <w:t xml:space="preserve">PHP Software Developer — Part-time Subcontract / Consulting Engagement</w:t>
       </w:r>
       <w:r>
         <w:rPr>
@@ -432,6 +432,23 @@
           <w:rtl w:val="false"/>
         </w:rPr>
         <w:t xml:space="preserve"> | August 2024 - January 2026 | Rome, Italy</w:t>
+      </w:r>
+    </w:p>
+    <w:p>
+      <w:pPr>
+        <w:bidi w:val="false"/>
+        <w:spacing w:after="120" w:before="120" w:line="259.20000000000005"/>
+        <w:jc w:val="left"/>
+      </w:pPr>
+      <w:r>
+        <w:rPr>
+          <w:rFonts w:ascii="Aptos" w:cs="Aptos" w:eastAsia="Aptos" w:hAnsi="Aptos"/>
+          <w:color w:val="000000"/>
+          <w:sz w:val="24"/>
+          <w:szCs w:val="24"/>
+          <w:rtl w:val="false"/>
+        </w:rPr>
+        <w:t xml:space="preserve">Concurrent engagement alongside the Simple.life role.</w:t>
       </w:r>
     </w:p>
     <w:p>

</xml_diff>